<commit_message>
feat(termo-service): update document templates and enhance data placeholders
- Added new Bash commands for image inspection and document editing processes in settings.local.json.
- Updated "TERMO ACERTO COMPLEMENTAR" and "TERMO ACERTO PARCIAL" documents to include additional financial placeholders for clarity, such as taxa de juro, percentual financiado, and data de assinatura.
- Enhanced the buildTermoValues function to accommodate new placeholders, ensuring accurate data representation in generated documents.

These changes improve the document generation process and enhance the clarity of financial agreements.
</commit_message>
<xml_diff>
--- a/sistema-hv/docs/modelos-termo/TERMO ACERTO COMPLEMENTAR.docx
+++ b/sistema-hv/docs/modelos-termo/TERMO ACERTO COMPLEMENTAR.docx
@@ -144,49 +144,10 @@
           <w:b w:val="1"/>
           <w:bCs w:val="1"/>
           <w:smallCaps w:val="1"/>
-        </w:rPr>
-        <w:drawing>
-          <wp:inline distB="114300" distT="114300" distL="114300" distR="114300">
-            <wp:extent cx="2001083" cy="1048955"/>
-            <wp:effectExtent b="25400" l="25400" r="25400" t="25400"/>
-            <wp:docPr id="6" name="image4.png"/>
-            <a:graphic>
-              <a:graphicData uri="http://schemas.openxmlformats.org/drawingml/2006/picture">
-                <pic:pic>
-                  <pic:nvPicPr>
-                    <pic:cNvPr id="0" name="image4.png"/>
-                    <pic:cNvPicPr preferRelativeResize="0"/>
-                  </pic:nvPicPr>
-                  <pic:blipFill>
-                    <a:blip r:embed="rId6"/>
-                    <a:srcRect b="0" l="0" r="0" t="0"/>
-                    <a:stretch>
-                      <a:fillRect/>
-                    </a:stretch>
-                  </pic:blipFill>
-                  <pic:spPr>
-                    <a:xfrm>
-                      <a:off x="0" y="0"/>
-                      <a:ext cx="2001083" cy="1048955"/>
-                    </a:xfrm>
-                    <a:prstGeom prst="rect"/>
-                    <a:ln w="25400">
-                      <a:solidFill>
-                        <a:srgbClr val="000000"/>
-                      </a:solidFill>
-                      <a:prstDash val="solid"/>
-                    </a:ln>
-                  </pic:spPr>
-                </pic:pic>
-              </a:graphicData>
-            </a:graphic>
-          </wp:inline>
-        </w:drawing>
-      </w:r>
-      <w:r>
-        <w:rPr>
-          <w:rtl w:val="0"/>
-        </w:rPr>
+          <w:u w:val="single"/>
+          <w:rtl w:val="0"/>
+        </w:rPr>
+        <w:t xml:space="preserve">SALDO DEVEDOR (sem encargos e sem juros por atraso): R$ &lt;saldo_originario&gt;</w:t>
       </w:r>
     </w:p>
     <w:p>
@@ -250,49 +211,73 @@
           <w:b w:val="1"/>
           <w:bCs w:val="1"/>
           <w:smallCaps w:val="1"/>
-        </w:rPr>
-        <w:drawing>
-          <wp:inline distB="114300" distT="114300" distL="114300" distR="114300">
-            <wp:extent cx="2277900" cy="1312154"/>
-            <wp:effectExtent b="25400" l="25400" r="25400" t="25400"/>
-            <wp:docPr id="4" name="image3.png"/>
-            <a:graphic>
-              <a:graphicData uri="http://schemas.openxmlformats.org/drawingml/2006/picture">
-                <pic:pic>
-                  <pic:nvPicPr>
-                    <pic:cNvPr id="0" name="image3.png"/>
-                    <pic:cNvPicPr preferRelativeResize="0"/>
-                  </pic:nvPicPr>
-                  <pic:blipFill>
-                    <a:blip r:embed="rId7"/>
-                    <a:srcRect b="0" l="0" r="0" t="0"/>
-                    <a:stretch>
-                      <a:fillRect/>
-                    </a:stretch>
-                  </pic:blipFill>
-                  <pic:spPr>
-                    <a:xfrm>
-                      <a:off x="0" y="0"/>
-                      <a:ext cx="2277900" cy="1312154"/>
-                    </a:xfrm>
-                    <a:prstGeom prst="rect"/>
-                    <a:ln w="25400">
-                      <a:solidFill>
-                        <a:srgbClr val="000000"/>
-                      </a:solidFill>
-                      <a:prstDash val="solid"/>
-                    </a:ln>
-                  </pic:spPr>
-                </pic:pic>
-              </a:graphicData>
-            </a:graphic>
-          </wp:inline>
-        </w:drawing>
-      </w:r>
-      <w:r>
-        <w:rPr>
-          <w:rtl w:val="0"/>
-        </w:rPr>
+          <w:u w:val="single"/>
+          <w:rtl w:val="0"/>
+        </w:rPr>
+        <w:t xml:space="preserve">Saldo Devedor: R$ &lt;saldo_antes&gt;</w:t>
+      </w:r>
+    </w:p>
+    <w:p>
+      <w:pPr>
+        <w:spacing w:after="280" w:before="280" w:line="360" w:lineRule="auto"/>
+        <w:jc w:val="center"/>
+        <w:rPr>
+          <w:b w:val="1"/>
+          <w:bCs w:val="1"/>
+          <w:smallCaps w:val="1"/>
+        </w:rPr>
+      </w:pPr>
+      <w:r>
+        <w:rPr>
+          <w:b w:val="1"/>
+          <w:bCs w:val="1"/>
+          <w:smallCaps w:val="1"/>
+          <w:u w:val="single"/>
+          <w:rtl w:val="0"/>
+        </w:rPr>
+        <w:t xml:space="preserve">Taxa de Juro: &lt;taxa_juros&gt;</w:t>
+      </w:r>
+    </w:p>
+    <w:p>
+      <w:pPr>
+        <w:spacing w:after="280" w:before="280" w:line="360" w:lineRule="auto"/>
+        <w:jc w:val="center"/>
+        <w:rPr>
+          <w:b w:val="1"/>
+          <w:bCs w:val="1"/>
+          <w:smallCaps w:val="1"/>
+        </w:rPr>
+      </w:pPr>
+      <w:r>
+        <w:rPr>
+          <w:b w:val="1"/>
+          <w:bCs w:val="1"/>
+          <w:smallCaps w:val="1"/>
+          <w:u w:val="single"/>
+          <w:rtl w:val="0"/>
+        </w:rPr>
+        <w:t xml:space="preserve">% Financiado: &lt;percentual_financiado&gt;</w:t>
+      </w:r>
+    </w:p>
+    <w:p>
+      <w:pPr>
+        <w:spacing w:after="280" w:before="280" w:line="360" w:lineRule="auto"/>
+        <w:jc w:val="center"/>
+        <w:rPr>
+          <w:b w:val="1"/>
+          <w:bCs w:val="1"/>
+          <w:smallCaps w:val="1"/>
+        </w:rPr>
+      </w:pPr>
+      <w:r>
+        <w:rPr>
+          <w:b w:val="1"/>
+          <w:bCs w:val="1"/>
+          <w:smallCaps w:val="1"/>
+          <w:u w:val="single"/>
+          <w:rtl w:val="0"/>
+        </w:rPr>
+        <w:t xml:space="preserve">Data Assinatura: &lt;data_assinatura_fies&gt;</w:t>
       </w:r>
     </w:p>
     <w:p>
@@ -416,49 +401,10 @@
           <w:b w:val="1"/>
           <w:bCs w:val="1"/>
           <w:smallCaps w:val="1"/>
-        </w:rPr>
-        <w:drawing>
-          <wp:inline distB="114300" distT="114300" distL="114300" distR="114300">
-            <wp:extent cx="2149313" cy="1319380"/>
-            <wp:effectExtent b="25400" l="25400" r="25400" t="25400"/>
-            <wp:docPr id="3" name="image2.png"/>
-            <a:graphic>
-              <a:graphicData uri="http://schemas.openxmlformats.org/drawingml/2006/picture">
-                <pic:pic>
-                  <pic:nvPicPr>
-                    <pic:cNvPr id="0" name="image2.png"/>
-                    <pic:cNvPicPr preferRelativeResize="0"/>
-                  </pic:nvPicPr>
-                  <pic:blipFill>
-                    <a:blip r:embed="rId8"/>
-                    <a:srcRect b="0" l="0" r="0" t="0"/>
-                    <a:stretch>
-                      <a:fillRect/>
-                    </a:stretch>
-                  </pic:blipFill>
-                  <pic:spPr>
-                    <a:xfrm>
-                      <a:off x="0" y="0"/>
-                      <a:ext cx="2149313" cy="1319380"/>
-                    </a:xfrm>
-                    <a:prstGeom prst="rect"/>
-                    <a:ln w="25400">
-                      <a:solidFill>
-                        <a:srgbClr val="000000"/>
-                      </a:solidFill>
-                      <a:prstDash val="solid"/>
-                    </a:ln>
-                  </pic:spPr>
-                </pic:pic>
-              </a:graphicData>
-            </a:graphic>
-          </wp:inline>
-        </w:drawing>
-      </w:r>
-      <w:r>
-        <w:rPr>
-          <w:rtl w:val="0"/>
-        </w:rPr>
+          <w:u w:val="single"/>
+          <w:rtl w:val="0"/>
+        </w:rPr>
+        <w:t xml:space="preserve">SALDO DEVEDOR (sem encargos e sem juros por atraso): R$ &lt;saldo_depois&gt;</w:t>
       </w:r>
     </w:p>
     <w:p>

</xml_diff>